<commit_message>
Add Multi-Modal Autonomous Agent & Desktop OS case study and resume updates
</commit_message>
<xml_diff>
--- a/public/resume.docx
+++ b/public/resume.docx
@@ -1236,6 +1236,38 @@
         <w:jc w:val="both"/>
       </w:pPr>
     </w:p>
+    <w:p>
+      <w:r>
+        <w:rPr>
+          <w:b/>
+          <w:i/>
+        </w:rPr>
+        <w:t>Multi-Modal Autonomous Agent &amp; Desktop OS (LiveKit, Hermes &amp; Gemini)</w:t>
+      </w:r>
+    </w:p>
+    <w:p>
+      <w:r>
+        <w:rPr>
+          <w:b/>
+        </w:rPr>
+        <w:t xml:space="preserve">• </w:t>
+      </w:r>
+      <w:r>
+        <w:t>Architected and delivered a local-first multi-modal AI agent system integrating LiveKit real-time voice streaming, Google Gemini, and native macOS desktop automation (Mail, Calendar, Reminders).</w:t>
+      </w:r>
+    </w:p>
+    <w:p>
+      <w:r>
+        <w:rPr>
+          <w:b/>
+        </w:rPr>
+        <w:t xml:space="preserve">• </w:t>
+      </w:r>
+      <w:r>
+        <w:t>Designed hybrid cloud-edge orchestration with persistent browser automation, launchd background daemons, and strict Human-in-the-Loop (HITL) governance, operating at $0 idle cost (&lt;$10/mo active).</w:t>
+      </w:r>
+    </w:p>
+    <w:p/>
     <w:p>
       <w:pPr>
         <w:spacing w:after="0"/>

</xml_diff>

<commit_message>
Update master resume with token governance and re-export PDF
</commit_message>
<xml_diff>
--- a/public/resume.docx
+++ b/public/resume.docx
@@ -75,13 +75,7 @@
         <w:jc w:val="both"/>
       </w:pPr>
       <w:r>
-        <w:t>8+ years of combined program delivery, operations, and people-leadership experience</w:t>
-      </w:r>
-      <w:r>
-        <w:t xml:space="preserve">. </w:t>
-      </w:r>
-      <w:r>
-        <w:t>Experienced in leading multi-workstream AI/ML, GenAI, and data-platform initiatives across engineering, data, architecture, and business teams. Skilled in Agile/Scrum/Scrumban delivery, RAID governance, executive reporting, stakeholder alignment, capacity planning, and compliance/PII risk. Hands-on exposure to LLM evaluation, RAG pipelines, agentic workflow automation, and responsible AI, supported by PMP certification and an M.S. in Business Analytics.</w:t>
+        <w:t>8+ years of combined program delivery, operations, and people-leadership experience. Experienced in leading multi-workstream AI/ML, GenAI, and data-platform initiatives across engineering, data, architecture, and business teams. Skilled in Agile/Scrum/Scrumban delivery, RAID governance, executive reporting, stakeholder alignment, capacity planning, and compliance/PII risk. Hands-on exposure to LLM evaluation, RAG pipelines, agentic workflow automation, and responsible AI, supported by PMP certification and an M.S. in Business Analytics.</w:t>
       </w:r>
     </w:p>
     <w:p>
@@ -866,16 +860,7 @@
           <w:iCs/>
           <w:sz w:val="19"/>
         </w:rPr>
-        <w:t>Anno Domini</w:t>
-      </w:r>
-      <w:r>
-        <w:rPr>
-          <w:b/>
-          <w:i/>
-          <w:iCs/>
-          <w:sz w:val="19"/>
-        </w:rPr>
-        <w:t xml:space="preserve"> | Lead</w:t>
+        <w:t>Anno Domini | Lead</w:t>
       </w:r>
       <w:r>
         <w:rPr>
@@ -1237,6 +1222,9 @@
       </w:pPr>
     </w:p>
     <w:p>
+      <w:pPr>
+        <w:ind w:left="-180"/>
+      </w:pPr>
       <w:r>
         <w:rPr>
           <w:b/>
@@ -1246,6 +1234,9 @@
       </w:r>
     </w:p>
     <w:p>
+      <w:pPr>
+        <w:ind w:left="-180"/>
+      </w:pPr>
       <w:r>
         <w:rPr>
           <w:b/>
@@ -1257,6 +1248,9 @@
       </w:r>
     </w:p>
     <w:p>
+      <w:pPr>
+        <w:ind w:left="-180"/>
+      </w:pPr>
       <w:r>
         <w:rPr>
           <w:b/>
@@ -1264,7 +1258,7 @@
         <w:t xml:space="preserve">• </w:t>
       </w:r>
       <w:r>
-        <w:t>Designed hybrid cloud-edge orchestration with persistent browser automation, launchd background daemons, and strict Human-in-the-Loop (HITL) governance, operating at $0 idle cost (&lt;$10/mo active).</w:t>
+        <w:t>Engineered hybrid cloud-edge orchestration with multi-tier token governance, cutting API spend &gt;90% via script short-circuiting, with background daemons and strict Human-in-the-Loop (HITL) safety controls.</w:t>
       </w:r>
     </w:p>
     <w:p/>

</xml_diff>